<commit_message>
Correct the CVs to the AWS to Render migration and drop the data science summary lines
</commit_message>
<xml_diff>
--- a/cv/research/Obed_Alemya_Research_CV.docx
+++ b/cv/research/Obed_Alemya_Research_CV.docx
@@ -246,7 +246,7 @@
         <w:pStyle w:val="ListBullet"/>
       </w:pPr>
       <w:r>
-        <w:t>Own the low-cost infrastructure project end to end: documented the production AWS estate (ECS Fargate, ECR, S3, CloudWatch, API Gateway, Amplify, Secrets Manager), presented milestone reviews, and researched low-cost alternatives.</w:t>
+        <w:t>Lead the Low-Cost Infrastructure project: researched, evaluated and planned the transition of the production stack from AWS to low-cost and free-tier providers.</w:t>
       </w:r>
     </w:p>
     <w:p>
@@ -254,7 +254,7 @@
         <w:pStyle w:val="ListBullet"/>
       </w:pPr>
       <w:r>
-        <w:t>Drove cloud cost optimization: right-sized ECS allocations and follow-up reviews, reducing the November 2025 bill to $353.26/month from a higher baseline.</w:t>
+        <w:t>Documented the production AWS estate (ECS Fargate, ECR, S3, CloudWatch, API Gateway, Amplify, Secrets Manager) and drove cost optimization, bringing the PROD bill to $353.26/month.</w:t>
       </w:r>
     </w:p>
     <w:p>
@@ -262,7 +262,7 @@
         <w:pStyle w:val="ListBullet"/>
       </w:pPr>
       <w:r>
-        <w:t>Authored the AWS to Firebase/GCP migration analysis (cost model $332-488/month vs $353.26, effort and risk assessment) with the recommendation to optimize AWS instead of migrating.</w:t>
+        <w:t>Authored the AWS to Firebase/GCP migration analysis and the provider comparison matrix (Render, Railway, Cloudflare, Fly.io, Vercel) with scaling thresholds and a decision framework for stakeholders.</w:t>
       </w:r>
     </w:p>
     <w:p>
@@ -270,7 +270,7 @@
         <w:pStyle w:val="ListBullet"/>
       </w:pPr>
       <w:r>
-        <w:t>Set up and validated new production infrastructure on Render with MongoDB Atlas access roles ahead of cutover.</w:t>
+        <w:t>Planned and executed the phased migration to Render, starting with the most resource-intensive service (botai), then be-app and fe-web: dual-workspace Hobby setup, hybrid secret management, Squarespace DNS and SSL cutover, and end-to-end validation including Stripe and auth flows.</w:t>
       </w:r>
     </w:p>
     <w:p>
@@ -278,7 +278,7 @@
         <w:pStyle w:val="ListBullet"/>
       </w:pPr>
       <w:r>
-        <w:t>Direct the hiring pipeline strategy: questionnaire design and rollout to 90 candidates, two-stage filtering to a pool of 34, and technical interview preparation, delegating execution.</w:t>
+        <w:t>Rebuilt CI/CD on Render with tag-based GitHub Actions workflows (RENDER-*), post-deploy health checks and a keep-warm ping workflow for free-tier services; chose email alerting over webhooks on cost grounds.</w:t>
       </w:r>
     </w:p>
     <w:p>
@@ -286,7 +286,15 @@
         <w:pStyle w:val="ListBullet"/>
       </w:pPr>
       <w:r>
-        <w:t>Designed retention analytics: uncovered and fixed a signup event design flaw (isNewUser gating on signup_successful firing on sign-in) and stood up the production traction sheet.</w:t>
+        <w:t>Runs STAG and PROD on Render at roughly $50-60/month combined, down from hundreds per month on AWS.</w:t>
+      </w:r>
+    </w:p>
+    <w:p>
+      <w:pPr>
+        <w:pStyle w:val="ListBullet"/>
+      </w:pPr>
+      <w:r>
+        <w:t>Direct the hiring pipeline strategy (questionnaire to 90 candidates, two-stage filtering to a pool of 34, technical interviews) and retention analytics.</w:t>
       </w:r>
     </w:p>
     <w:p>
@@ -502,7 +510,7 @@
         <w:t xml:space="preserve">Cloud &amp; DevOps: </w:t>
       </w:r>
       <w:r>
-        <w:t>AWS (ECS Fargate, ECR, S3, CloudWatch, API Gateway, Amplify, Lambda, Secrets Manager), Docker, GitHub Actions, Nginx, HAProxy, Puppet, Fabric, Certbot, Render, Firebase, MongoDB Atlas</w:t>
+        <w:t>AWS (ECS Fargate, ECR, S3, CloudWatch, API Gateway, Amplify, Lambda, Secrets Manager), Render, Docker, GitHub Actions, Nginx, HAProxy, Puppet, Fabric, Certbot, Firebase, MongoDB Atlas</w:t>
       </w:r>
     </w:p>
     <w:p>

</xml_diff>

<commit_message>
Correct the CVs to the AWS to Render migration and drop the data science summary lines (#6)
</commit_message>
<xml_diff>
--- a/cv/research/Obed_Alemya_Research_CV.docx
+++ b/cv/research/Obed_Alemya_Research_CV.docx
@@ -246,7 +246,7 @@
         <w:pStyle w:val="ListBullet"/>
       </w:pPr>
       <w:r>
-        <w:t>Own the low-cost infrastructure project end to end: documented the production AWS estate (ECS Fargate, ECR, S3, CloudWatch, API Gateway, Amplify, Secrets Manager), presented milestone reviews, and researched low-cost alternatives.</w:t>
+        <w:t>Lead the Low-Cost Infrastructure project: researched, evaluated and planned the transition of the production stack from AWS to low-cost and free-tier providers.</w:t>
       </w:r>
     </w:p>
     <w:p>
@@ -254,7 +254,7 @@
         <w:pStyle w:val="ListBullet"/>
       </w:pPr>
       <w:r>
-        <w:t>Drove cloud cost optimization: right-sized ECS allocations and follow-up reviews, reducing the November 2025 bill to $353.26/month from a higher baseline.</w:t>
+        <w:t>Documented the production AWS estate (ECS Fargate, ECR, S3, CloudWatch, API Gateway, Amplify, Secrets Manager) and drove cost optimization, bringing the PROD bill to $353.26/month.</w:t>
       </w:r>
     </w:p>
     <w:p>
@@ -262,7 +262,7 @@
         <w:pStyle w:val="ListBullet"/>
       </w:pPr>
       <w:r>
-        <w:t>Authored the AWS to Firebase/GCP migration analysis (cost model $332-488/month vs $353.26, effort and risk assessment) with the recommendation to optimize AWS instead of migrating.</w:t>
+        <w:t>Authored the AWS to Firebase/GCP migration analysis and the provider comparison matrix (Render, Railway, Cloudflare, Fly.io, Vercel) with scaling thresholds and a decision framework for stakeholders.</w:t>
       </w:r>
     </w:p>
     <w:p>
@@ -270,7 +270,7 @@
         <w:pStyle w:val="ListBullet"/>
       </w:pPr>
       <w:r>
-        <w:t>Set up and validated new production infrastructure on Render with MongoDB Atlas access roles ahead of cutover.</w:t>
+        <w:t>Planned and executed the phased migration to Render, starting with the most resource-intensive service (botai), then be-app and fe-web: dual-workspace Hobby setup, hybrid secret management, Squarespace DNS and SSL cutover, and end-to-end validation including Stripe and auth flows.</w:t>
       </w:r>
     </w:p>
     <w:p>
@@ -278,7 +278,7 @@
         <w:pStyle w:val="ListBullet"/>
       </w:pPr>
       <w:r>
-        <w:t>Direct the hiring pipeline strategy: questionnaire design and rollout to 90 candidates, two-stage filtering to a pool of 34, and technical interview preparation, delegating execution.</w:t>
+        <w:t>Rebuilt CI/CD on Render with tag-based GitHub Actions workflows (RENDER-*), post-deploy health checks and a keep-warm ping workflow for free-tier services; chose email alerting over webhooks on cost grounds.</w:t>
       </w:r>
     </w:p>
     <w:p>
@@ -286,7 +286,15 @@
         <w:pStyle w:val="ListBullet"/>
       </w:pPr>
       <w:r>
-        <w:t>Designed retention analytics: uncovered and fixed a signup event design flaw (isNewUser gating on signup_successful firing on sign-in) and stood up the production traction sheet.</w:t>
+        <w:t>Runs STAG and PROD on Render at roughly $50-60/month combined, down from hundreds per month on AWS.</w:t>
+      </w:r>
+    </w:p>
+    <w:p>
+      <w:pPr>
+        <w:pStyle w:val="ListBullet"/>
+      </w:pPr>
+      <w:r>
+        <w:t>Direct the hiring pipeline strategy (questionnaire to 90 candidates, two-stage filtering to a pool of 34, technical interviews) and retention analytics.</w:t>
       </w:r>
     </w:p>
     <w:p>
@@ -502,7 +510,7 @@
         <w:t xml:space="preserve">Cloud &amp; DevOps: </w:t>
       </w:r>
       <w:r>
-        <w:t>AWS (ECS Fargate, ECR, S3, CloudWatch, API Gateway, Amplify, Lambda, Secrets Manager), Docker, GitHub Actions, Nginx, HAProxy, Puppet, Fabric, Certbot, Render, Firebase, MongoDB Atlas</w:t>
+        <w:t>AWS (ECS Fargate, ECR, S3, CloudWatch, API Gateway, Amplify, Lambda, Secrets Manager), Render, Docker, GitHub Actions, Nginx, HAProxy, Puppet, Fabric, Certbot, Firebase, MongoDB Atlas</w:t>
       </w:r>
     </w:p>
     <w:p>

</xml_diff>

<commit_message>
Describe the infrastructure work without internal branding and add the fish feeder project
</commit_message>
<xml_diff>
--- a/cv/research/Obed_Alemya_Research_CV.docx
+++ b/cv/research/Obed_Alemya_Research_CV.docx
@@ -246,15 +246,7 @@
         <w:pStyle w:val="ListBullet"/>
       </w:pPr>
       <w:r>
-        <w:t>Lead the Low-Cost Infrastructure project: researched, evaluated and planned the transition of the production stack from AWS to low-cost and free-tier providers.</w:t>
-      </w:r>
-    </w:p>
-    <w:p>
-      <w:pPr>
-        <w:pStyle w:val="ListBullet"/>
-      </w:pPr>
-      <w:r>
-        <w:t>Documented the production AWS estate (ECS Fargate, ECR, S3, CloudWatch, API Gateway, Amplify, Secrets Manager) and drove cost optimization, bringing the PROD bill to $353.26/month.</w:t>
+        <w:t>Led a project assessing the production infrastructure and its cost: documented the AWS estate (ECS Fargate, ECR, S3, CloudWatch, API Gateway, Amplify, Secrets Manager), built the provider comparison and decision framework, and executed the phased migration to Render (heaviest service first) with tag-based GitHub Actions deploys, DNS and SSL cutover, and end-to-end validation.</w:t>
       </w:r>
     </w:p>
     <w:p>

</xml_diff>

<commit_message>
Describe the infrastructure work without internal branding and add the fish feeder project (#12)
</commit_message>
<xml_diff>
--- a/cv/research/Obed_Alemya_Research_CV.docx
+++ b/cv/research/Obed_Alemya_Research_CV.docx
@@ -246,15 +246,7 @@
         <w:pStyle w:val="ListBullet"/>
       </w:pPr>
       <w:r>
-        <w:t>Lead the Low-Cost Infrastructure project: researched, evaluated and planned the transition of the production stack from AWS to low-cost and free-tier providers.</w:t>
-      </w:r>
-    </w:p>
-    <w:p>
-      <w:pPr>
-        <w:pStyle w:val="ListBullet"/>
-      </w:pPr>
-      <w:r>
-        <w:t>Documented the production AWS estate (ECS Fargate, ECR, S3, CloudWatch, API Gateway, Amplify, Secrets Manager) and drove cost optimization, bringing the PROD bill to $353.26/month.</w:t>
+        <w:t>Led a project assessing the production infrastructure and its cost: documented the AWS estate (ECS Fargate, ECR, S3, CloudWatch, API Gateway, Amplify, Secrets Manager), built the provider comparison and decision framework, and executed the phased migration to Render (heaviest service first) with tag-based GitHub Actions deploys, DNS and SSL cutover, and end-to-end validation.</w:t>
       </w:r>
     </w:p>
     <w:p>

</xml_diff>

<commit_message>
State the two hiring rounds accurately in the CVs and drafts
</commit_message>
<xml_diff>
--- a/cv/research/Obed_Alemya_Research_CV.docx
+++ b/cv/research/Obed_Alemya_Research_CV.docx
@@ -286,7 +286,15 @@
         <w:pStyle w:val="ListBullet"/>
       </w:pPr>
       <w:r>
-        <w:t>Ran the team hiring process twice end to end (questionnaire design and rollout to 90 candidates, two-stage filtering to a final pool, technical interviews) and built the product retention analytics.</w:t>
+        <w:t>Ran the team hiring round of 2025 end to end on free-tier tooling: published job ads, imported and screened candidates in SmartRecruiter, set up cal.com scheduling, and conducted technical and behavioral interviews with shared ratings.</w:t>
+      </w:r>
+    </w:p>
+    <w:p>
+      <w:pPr>
+        <w:pStyle w:val="ListBullet"/>
+      </w:pPr>
+      <w:r>
+        <w:t>Now leading the second hiring round: documented the 2025 process, designed the questionnaire sent to 90 candidates with two-stage filtering to a final pool, and owns strategy while delegating execution. Also built the product retention analytics.</w:t>
       </w:r>
     </w:p>
     <w:p>

</xml_diff>

<commit_message>
State the two hiring rounds accurately in the CVs and drafts (#14)
</commit_message>
<xml_diff>
--- a/cv/research/Obed_Alemya_Research_CV.docx
+++ b/cv/research/Obed_Alemya_Research_CV.docx
@@ -286,7 +286,15 @@
         <w:pStyle w:val="ListBullet"/>
       </w:pPr>
       <w:r>
-        <w:t>Ran the team hiring process twice end to end (questionnaire design and rollout to 90 candidates, two-stage filtering to a final pool, technical interviews) and built the product retention analytics.</w:t>
+        <w:t>Ran the team hiring round of 2025 end to end on free-tier tooling: published job ads, imported and screened candidates in SmartRecruiter, set up cal.com scheduling, and conducted technical and behavioral interviews with shared ratings.</w:t>
+      </w:r>
+    </w:p>
+    <w:p>
+      <w:pPr>
+        <w:pStyle w:val="ListBullet"/>
+      </w:pPr>
+      <w:r>
+        <w:t>Now leading the second hiring round: documented the 2025 process, designed the questionnaire sent to 90 candidates with two-stage filtering to a final pool, and owns strategy while delegating execution. Also built the product retention analytics.</w:t>
       </w:r>
     </w:p>
     <w:p>

</xml_diff>